<commit_message>
Refine presentation visuals and package sourced assets
</commit_message>
<xml_diff>
--- a/docs/presentation/Treadlight-speech.docx
+++ b/docs/presentation/Treadlight-speech.docx
@@ -87,7 +87,7 @@
         <w:pStyle w:val="Heading1"/>
       </w:pPr>
       <w:r>
-        <w:t xml:space="preserve">第 2 页｜让行动改变世界</w:t>
+        <w:t xml:space="preserve">第 2 页｜光之遗迹里的修复之旅</w:t>
       </w:r>
     </w:p>
     <w:p>
@@ -119,12 +119,13 @@
         <w:pStyle w:val="Cue"/>
       </w:pPr>
       <w:r>
-        <w:t xml:space="preserve">排练提示：指向“断路—造路—留光”示意，避免逐字读画面。</w:t>
-      </w:r>
-    </w:p>
-    <w:p>
-      <w:pPr>
-        <w:pStyle w:val="Heading1"/>
+        <w:t xml:space="preserve">排练提示：指向“观察—造路—留光”示意，避免逐字读画面。</w:t>
+      </w:r>
+    </w:p>
+    <w:p>
+      <w:pPr>
+        <w:pStyle w:val="Heading1"/>
+        <w:pageBreakBefore/>
       </w:pPr>
       <w:r>
         <w:t xml:space="preserve">第 3 页｜起跳造路，落拍留光</w:t>
@@ -179,16 +180,11 @@
       </w:r>
     </w:p>
     <w:p>
-      <w:r>
-        <w:br w:type="page"/>
-      </w:r>
-    </w:p>
-    <w:p>
-      <w:pPr>
-        <w:pStyle w:val="Heading1"/>
-      </w:pPr>
-      <w:r>
-        <w:t xml:space="preserve">第 4 页｜有节奏，也有等待的空间</w:t>
+      <w:pPr>
+        <w:pStyle w:val="Heading1"/>
+      </w:pPr>
+      <w:r>
+        <w:t xml:space="preserve">第 4 页｜可以等待，也可以再次尝试</w:t>
       </w:r>
     </w:p>
     <w:p>
@@ -228,12 +224,13 @@
         <w:pStyle w:val="Cue"/>
       </w:pPr>
       <w:r>
-        <w:t xml:space="preserve">排练提示：按三张卡片顺序解释，不必读全部参数。</w:t>
-      </w:r>
-    </w:p>
-    <w:p>
-      <w:pPr>
-        <w:pStyle w:val="Heading1"/>
+        <w:t xml:space="preserve">排练提示：从左到右介绍三组信息，不必读全部参数。</w:t>
+      </w:r>
+    </w:p>
+    <w:p>
+      <w:pPr>
+        <w:pStyle w:val="Heading1"/>
+        <w:pageBreakBefore/>
       </w:pPr>
       <w:r>
         <w:t xml:space="preserve">第 5 页｜三个房间，逐步掌握</w:t>
@@ -300,7 +297,7 @@
         <w:pStyle w:val="Heading1"/>
       </w:pPr>
       <w:r>
-        <w:t xml:space="preserve">第 6 页｜让节拍看得见、听得到</w:t>
+        <w:t xml:space="preserve">第 6 页｜听到的节拍，对应看见的反馈</w:t>
       </w:r>
     </w:p>
     <w:p>
@@ -340,17 +337,13 @@
         <w:pStyle w:val="Cue"/>
       </w:pPr>
       <w:r>
-        <w:t xml:space="preserve">排练提示：指向截图中的青桥、金桥与节拍反馈；实现只讲统一时钟。</w:t>
-      </w:r>
-    </w:p>
-    <w:p>
-      <w:r>
-        <w:br w:type="page"/>
-      </w:r>
-    </w:p>
-    <w:p>
-      <w:pPr>
-        <w:pStyle w:val="Heading1"/>
+        <w:t xml:space="preserve">排练提示：指向截图中的金桥、节拍灯与校准值；实现只讲统一时钟。</w:t>
+      </w:r>
+    </w:p>
+    <w:p>
+      <w:pPr>
+        <w:pStyle w:val="Heading1"/>
+        <w:pageBreakBefore/>
       </w:pPr>
       <w:r>
         <w:t xml:space="preserve">第 7 页｜当前成果与协作安排</w:t>
@@ -367,6 +360,7 @@
     <w:p>
       <w:pPr>
         <w:pStyle w:val="Normal"/>
+        <w:ind w:right="480"/>
       </w:pPr>
       <w:r>
         <w:t xml:space="preserve">当前版本已经具备三个房间、教程、暂停、重试、计分和通关结算，也完成了现有自动检查与 Windows 启动验证。</w:t>
@@ -472,6 +466,7 @@
     </w:rPrDefault>
     <w:pPrDefault>
       <w:pPr>
+        <w:wordWrap w:val="0"/>
         <w:spacing w:after="120" w:line="340" w:lineRule="auto"/>
       </w:pPr>
     </w:pPrDefault>

</xml_diff>